<commit_message>
Update rendered site from dev repo
</commit_message>
<xml_diff>
--- a/docs/writing/piece1_audit_plan.docx
+++ b/docs/writing/piece1_audit_plan.docx
@@ -171,7 +171,7 @@
     </w:p>
     <w:bookmarkEnd w:id="11"/>
     <w:bookmarkEnd w:id="12"/>
-    <w:bookmarkStart w:id="25" w:name="audit-test-schedule"/>
+    <w:bookmarkStart w:id="26" w:name="audit-test-schedule"/>
     <w:p>
       <w:pPr>
         <w:pStyle w:val="Heading2"/>
@@ -1048,7 +1048,7 @@
     </w:p>
     <w:bookmarkEnd w:id="18"/>
     <w:bookmarkEnd w:id="19"/>
-    <w:bookmarkStart w:id="24" w:name="risk-1.3"/>
+    <w:bookmarkStart w:id="25" w:name="risk-1.3"/>
     <w:p>
       <w:pPr>
         <w:pStyle w:val="Heading3"/>
@@ -1568,7 +1568,7 @@
       </w:tr>
     </w:tbl>
     <w:bookmarkEnd w:id="22"/>
-    <w:bookmarkStart w:id="23" w:name="control-1.3.4"/>
+    <w:bookmarkStart w:id="24" w:name="control-1.3.4"/>
     <w:p>
       <w:pPr>
         <w:pStyle w:val="Heading4"/>
@@ -1764,9 +1764,208 @@
         <w:t xml:space="preserve">Methodological note: This schedule is informed by the Global Internal Audit Standards (Institute of Internal Auditors, 2024) and the Application Note: Global Internal Audit Standards in the UK Public Sector (Internal Audit Standards Advisory Board, December 2024, effective 1 April 2025). The Objectives → Risks → Controls → Tests methodology used here derives from the risk-based audit planning approach described in Standard 9.4 (Internal Audit Plan) of the Global Standards. The schedule is a management self-assessment tool, not an internal audit engagement, and does not produce an audit opinion.</w:t>
       </w:r>
     </w:p>
-    <w:bookmarkEnd w:id="23"/>
+    <w:p>
+      <w:r>
+        <w:pict>
+          <v:rect style="width:0;height:1.5pt" o:hralign="center" o:hrstd="t" o:hr="t"/>
+        </w:pict>
+      </w:r>
+    </w:p>
+    <w:p>
+      <w:pPr>
+        <w:pStyle w:val="FirstParagraph"/>
+      </w:pPr>
+      <w:hyperlink r:id="rId23">
+        <w:r>
+          <w:rPr>
+            <w:rStyle w:val="Hyperlink"/>
+          </w:rPr>
+          <w:t xml:space="preserve">Download as Word document</w:t>
+        </w:r>
+      </w:hyperlink>
+    </w:p>
     <w:bookmarkEnd w:id="24"/>
     <w:bookmarkEnd w:id="25"/>
+    <w:bookmarkEnd w:id="26"/>
+    <w:bookmarkStart w:id="31" w:name="recent-writing"/>
+    <w:p>
+      <w:pPr>
+        <w:pStyle w:val="Heading2"/>
+      </w:pPr>
+      <w:r>
+        <w:t xml:space="preserve">Recent Writing</w:t>
+      </w:r>
+    </w:p>
+    <w:p>
+      <w:pPr>
+        <w:pStyle w:val="FirstParagraph"/>
+      </w:pPr>
+      <w:hyperlink r:id="rId27">
+        <w:r>
+          <w:rPr>
+            <w:rStyle w:val="Hyperlink"/>
+            <w:b/>
+            <w:bCs/>
+          </w:rPr>
+          <w:t xml:space="preserve">The NHS is addicted to building dashboards. Is it time for a detox?</w:t>
+        </w:r>
+      </w:hyperlink>
+      <w:r>
+        <w:t xml:space="preserve"> </w:t>
+      </w:r>
+      <w:r>
+        <w:t xml:space="preserve">Why dashboards don’t work as intended, and what comes next.</w:t>
+      </w:r>
+    </w:p>
+    <w:p>
+      <w:pPr>
+        <w:pStyle w:val="BodyText"/>
+      </w:pPr>
+      <w:hyperlink r:id="rId28">
+        <w:r>
+          <w:rPr>
+            <w:rStyle w:val="Hyperlink"/>
+            <w:b/>
+            <w:bCs/>
+          </w:rPr>
+          <w:t xml:space="preserve">Analytics is becoming a profession. Is your organisation leading or following?</w:t>
+        </w:r>
+      </w:hyperlink>
+      <w:r>
+        <w:t xml:space="preserve"> </w:t>
+      </w:r>
+      <w:r>
+        <w:t xml:space="preserve">Why organisations that lead and celebrate the professionalisation of analysts will benefit the most.</w:t>
+      </w:r>
+    </w:p>
+    <w:p>
+      <w:pPr>
+        <w:pStyle w:val="BodyText"/>
+      </w:pPr>
+      <w:hyperlink r:id="rId29">
+        <w:r>
+          <w:rPr>
+            <w:rStyle w:val="Hyperlink"/>
+            <w:b/>
+            <w:bCs/>
+          </w:rPr>
+          <w:t xml:space="preserve">What data teams can learn from internal audit</w:t>
+        </w:r>
+      </w:hyperlink>
+      <w:r>
+        <w:t xml:space="preserve"> </w:t>
+      </w:r>
+      <w:r>
+        <w:t xml:space="preserve">Exploring gaps in analytical governance, and how looking through the perspective of an internal audit can strengthen analyst teams.</w:t>
+      </w:r>
+    </w:p>
+    <w:p>
+      <w:pPr>
+        <w:pStyle w:val="BodyText"/>
+      </w:pPr>
+      <w:hyperlink r:id="rId30">
+        <w:r>
+          <w:rPr>
+            <w:rStyle w:val="Hyperlink"/>
+          </w:rPr>
+          <w:t xml:space="preserve">View all writing →</w:t>
+        </w:r>
+      </w:hyperlink>
+    </w:p>
+    <w:p>
+      <w:r>
+        <w:pict>
+          <v:rect style="width:0;height:1.5pt" o:hralign="center" o:hrstd="t" o:hr="t"/>
+        </w:pict>
+      </w:r>
+    </w:p>
+    <w:bookmarkEnd w:id="31"/>
+    <w:bookmarkStart w:id="36" w:name="recent-projects"/>
+    <w:p>
+      <w:pPr>
+        <w:pStyle w:val="Heading2"/>
+      </w:pPr>
+      <w:r>
+        <w:t xml:space="preserve">Recent Projects</w:t>
+      </w:r>
+    </w:p>
+    <w:p>
+      <w:pPr>
+        <w:pStyle w:val="FirstParagraph"/>
+      </w:pPr>
+      <w:hyperlink r:id="rId32">
+        <w:r>
+          <w:rPr>
+            <w:rStyle w:val="Hyperlink"/>
+            <w:b/>
+            <w:bCs/>
+          </w:rPr>
+          <w:t xml:space="preserve">qvdr</w:t>
+        </w:r>
+      </w:hyperlink>
+      <w:r>
+        <w:t xml:space="preserve"> </w:t>
+      </w:r>
+      <w:r>
+        <w:t xml:space="preserve">An R package that reads QVD (QlikView Data) binary files into R tibbles.</w:t>
+      </w:r>
+    </w:p>
+    <w:p>
+      <w:pPr>
+        <w:pStyle w:val="BodyText"/>
+      </w:pPr>
+      <w:hyperlink r:id="rId33">
+        <w:r>
+          <w:rPr>
+            <w:rStyle w:val="Hyperlink"/>
+            <w:b/>
+            <w:bCs/>
+          </w:rPr>
+          <w:t xml:space="preserve">Statistics Methods Primer</w:t>
+        </w:r>
+      </w:hyperlink>
+      <w:r>
+        <w:t xml:space="preserve"> </w:t>
+      </w:r>
+      <w:r>
+        <w:t xml:space="preserve">A reference source for NHS analysts without a formal statistical background.</w:t>
+      </w:r>
+    </w:p>
+    <w:p>
+      <w:pPr>
+        <w:pStyle w:val="BodyText"/>
+      </w:pPr>
+      <w:hyperlink r:id="rId34">
+        <w:r>
+          <w:rPr>
+            <w:rStyle w:val="Hyperlink"/>
+            <w:b/>
+            <w:bCs/>
+          </w:rPr>
+          <w:t xml:space="preserve">Recipe App</w:t>
+        </w:r>
+      </w:hyperlink>
+      <w:r>
+        <w:t xml:space="preserve"> </w:t>
+      </w:r>
+      <w:r>
+        <w:t xml:space="preserve">An app for searching recipes based on ingredients and cuisine preferences.</w:t>
+      </w:r>
+    </w:p>
+    <w:p>
+      <w:pPr>
+        <w:pStyle w:val="BodyText"/>
+      </w:pPr>
+      <w:hyperlink r:id="rId35">
+        <w:r>
+          <w:rPr>
+            <w:rStyle w:val="Hyperlink"/>
+          </w:rPr>
+          <w:t xml:space="preserve">View all projects →</w:t>
+        </w:r>
+      </w:hyperlink>
+    </w:p>
+    <w:bookmarkEnd w:id="36"/>
     <w:sectPr>
       <w:footnotePr>
         <w:numRestart w:val="eachSect"/>

</xml_diff>